<commit_message>
feat: add Practice Exam slide and align courseware to the v2.0 assessment
Adds the Claude Certified Associate — Foundations practice exam slide
(142 slides). Lesson Plan and Learner Guide version record notes the
rewritten WA/PP and the 1-hour WA + 1-hour PP schedule; lab READMEs
pick up the shifted slide numbers.

Co-Authored-By: Claude Opus 5.5 <noreply@anthropic.com>
</commit_message>
<xml_diff>
--- a/courseware/LG-Multi AI Agents Workflow for Content Creation-v2.0.docx
+++ b/courseware/LG-Multi AI Agents Workflow for Content Creation-v2.0.docx
@@ -380,7 +380,7 @@
               <w:rPr>
                 <w:sz w:val="19"/>
               </w:rPr>
-              <w:t>Revamped in the house design of Agentic AI Applications with Codex (TGS-2023041081). One central case — Horizon Wealth Planning, a Singapore financial-planning firm — across 14 labs, each in its own folder: Claude Cowork sub-agents (research, ideation, personas, cadence, skills, measurement), Codex (website, compliance subagent, approval gate, video), Claude Code subagents and agent teams (social, newsletter and video teams with LinkedIn, Facebook and YouTube publishing behind a human approval gate) and Hermes Agent bots on a Kanban board. 2-hour assessment from 4:00 PM Day 2.</w:t>
+              <w:t>Revamped in the house design of Agentic AI Applications with Codex (TGS-2023041081). One central case — Horizon Wealth Planning, a Singapore financial-planning firm — across 14 labs, each in its own folder: Claude Cowork sub-agents (research, ideation, personas, cadence, skills, measurement), Codex (website, compliance subagent, approval gate, video), Claude Code subagents and agent teams (social, newsletter and video teams with LinkedIn, Facebook and YouTube publishing behind a human approval gate) and Hermes Agent bots on a Kanban board. Practice Exam slide (Claude Certified Associate — Foundations). WA (6 SAQ, K1-K6) and PP (4 tasks, A1-A7) rewritten for the v2.0 labs; assessment 4:00-6:00 PM Day 2 (WA 1 h, PP 1 h).</w:t>
             </w:r>
           </w:p>
         </w:tc>
@@ -438,7 +438,7 @@
         </w:rPr>
         <w:t>How to Use This Guide</w:t>
         <w:tab/>
-        <w:t>5</w:t>
+        <w:t>6</w:t>
       </w:r>
     </w:p>
     <w:p>
@@ -456,7 +456,7 @@
         </w:rPr>
         <w:t>The Scenario: Horizon Wealth Planning</w:t>
         <w:tab/>
-        <w:t>5</w:t>
+        <w:t>6</w:t>
       </w:r>
     </w:p>
     <w:p>
@@ -474,7 +474,7 @@
         </w:rPr>
         <w:t>About This Course</w:t>
         <w:tab/>
-        <w:t>5</w:t>
+        <w:t>6</w:t>
       </w:r>
     </w:p>
     <w:p>
@@ -492,7 +492,7 @@
         </w:rPr>
         <w:t>Learning Outcomes</w:t>
         <w:tab/>
-        <w:t>5</w:t>
+        <w:t>6</w:t>
       </w:r>
     </w:p>
     <w:p>
@@ -510,7 +510,7 @@
         </w:rPr>
         <w:t>One Firm, One Content Studio of Agents</w:t>
         <w:tab/>
-        <w:t>6</w:t>
+        <w:t>7</w:t>
       </w:r>
     </w:p>
     <w:p>
@@ -528,7 +528,7 @@
         </w:rPr>
         <w:t>Meet Horizon Wealth Planning</w:t>
         <w:tab/>
-        <w:t>6</w:t>
+        <w:t>7</w:t>
       </w:r>
     </w:p>
     <w:p>
@@ -546,7 +546,7 @@
         </w:rPr>
         <w:t>The Right Tool for Each Job</w:t>
         <w:tab/>
-        <w:t>6</w:t>
+        <w:t>7</w:t>
       </w:r>
     </w:p>
     <w:p>
@@ -564,7 +564,7 @@
         </w:rPr>
         <w:t>Course Outline</w:t>
         <w:tab/>
-        <w:t>7</w:t>
+        <w:t>8</w:t>
       </w:r>
     </w:p>
     <w:p>
@@ -582,7 +582,7 @@
         </w:rPr>
         <w:t>Lab Materials</w:t>
         <w:tab/>
-        <w:t>7</w:t>
+        <w:t>8</w:t>
       </w:r>
     </w:p>
     <w:p>
@@ -600,7 +600,7 @@
         </w:rPr>
         <w:t>Lesson Plan (9:00 AM – 6:00 PM)</w:t>
         <w:tab/>
-        <w:t>7</w:t>
+        <w:t>8</w:t>
       </w:r>
     </w:p>
     <w:p>
@@ -618,7 +618,7 @@
         </w:rPr>
         <w:t>Topic 1 — Multi-AI-Agent Content Ideation and Digital Storyboarding</w:t>
         <w:tab/>
-        <w:t>8</w:t>
+        <w:t>9</w:t>
       </w:r>
     </w:p>
     <w:p>
@@ -636,7 +636,7 @@
         </w:rPr>
         <w:t>Key ideas for Lab 1</w:t>
         <w:tab/>
-        <w:t>8</w:t>
+        <w:t>9</w:t>
       </w:r>
     </w:p>
     <w:p>
@@ -654,7 +654,7 @@
         </w:rPr>
         <w:t>From Prompts to Agent Teams</w:t>
         <w:tab/>
-        <w:t>8</w:t>
+        <w:t>9</w:t>
       </w:r>
     </w:p>
     <w:p>
@@ -672,7 +672,7 @@
         </w:rPr>
         <w:t>Why a Team of Agents?</w:t>
         <w:tab/>
-        <w:t>8</w:t>
+        <w:t>9</w:t>
       </w:r>
     </w:p>
     <w:p>
@@ -690,7 +690,7 @@
         </w:rPr>
         <w:t>The Agent Loop</w:t>
         <w:tab/>
-        <w:t>8</w:t>
+        <w:t>9</w:t>
       </w:r>
     </w:p>
     <w:p>
@@ -708,7 +708,7 @@
         </w:rPr>
         <w:t>Four Tools, One Studio</w:t>
         <w:tab/>
-        <w:t>9</w:t>
+        <w:t>10</w:t>
       </w:r>
     </w:p>
     <w:p>
@@ -726,7 +726,7 @@
         </w:rPr>
         <w:t>Get the Tools Ready</w:t>
         <w:tab/>
-        <w:t>9</w:t>
+        <w:t>10</w:t>
       </w:r>
     </w:p>
     <w:p>
@@ -744,7 +744,7 @@
         </w:rPr>
         <w:t>Claude Cowork and Sub-agents</w:t>
         <w:tab/>
-        <w:t>9</w:t>
+        <w:t>10</w:t>
       </w:r>
     </w:p>
     <w:p>
@@ -762,7 +762,7 @@
         </w:rPr>
         <w:t>The Research Team</w:t>
         <w:tab/>
-        <w:t>9</w:t>
+        <w:t>10</w:t>
       </w:r>
     </w:p>
     <w:p>
@@ -780,7 +780,7 @@
         </w:rPr>
         <w:t>Research You Can Trust</w:t>
         <w:tab/>
-        <w:t>9</w:t>
+        <w:t>10</w:t>
       </w:r>
     </w:p>
     <w:p>
@@ -798,7 +798,7 @@
         </w:rPr>
         <w:t>Lab 1 — A Research Team of Sub-agents</w:t>
         <w:tab/>
-        <w:t>10</w:t>
+        <w:t>11</w:t>
       </w:r>
     </w:p>
     <w:p>
@@ -816,7 +816,7 @@
         </w:rPr>
         <w:t>Key ideas for Lab 2</w:t>
         <w:tab/>
-        <w:t>11</w:t>
+        <w:t>12</w:t>
       </w:r>
     </w:p>
     <w:p>
@@ -834,7 +834,7 @@
         </w:rPr>
         <w:t>Codex: Plan Before You Build</w:t>
         <w:tab/>
-        <w:t>11</w:t>
+        <w:t>12</w:t>
       </w:r>
     </w:p>
     <w:p>
@@ -852,7 +852,7 @@
         </w:rPr>
         <w:t>The Retirement Calculator</w:t>
         <w:tab/>
-        <w:t>11</w:t>
+        <w:t>12</w:t>
       </w:r>
     </w:p>
     <w:p>
@@ -870,7 +870,7 @@
         </w:rPr>
         <w:t>Checklist and Contact Form</w:t>
         <w:tab/>
-        <w:t>12</w:t>
+        <w:t>13</w:t>
       </w:r>
     </w:p>
     <w:p>
@@ -888,7 +888,7 @@
         </w:rPr>
         <w:t>Lab 2 — Plan and Build the Horizon Website with Codex</w:t>
         <w:tab/>
-        <w:t>13</w:t>
+        <w:t>14</w:t>
       </w:r>
     </w:p>
     <w:p>
@@ -906,7 +906,7 @@
         </w:rPr>
         <w:t>Key ideas for Lab 3</w:t>
         <w:tab/>
-        <w:t>14</w:t>
+        <w:t>15</w:t>
       </w:r>
     </w:p>
     <w:p>
@@ -924,7 +924,7 @@
         </w:rPr>
         <w:t>Financial Content Is Regulated</w:t>
         <w:tab/>
-        <w:t>14</w:t>
+        <w:t>15</w:t>
       </w:r>
     </w:p>
     <w:p>
@@ -942,7 +942,7 @@
         </w:rPr>
         <w:t>A Reviewer That Only Reports</w:t>
         <w:tab/>
-        <w:t>14</w:t>
+        <w:t>15</w:t>
       </w:r>
     </w:p>
     <w:p>
@@ -960,7 +960,7 @@
         </w:rPr>
         <w:t>Lab 3 — A Compliance Subagent, Then Publish</w:t>
         <w:tab/>
-        <w:t>15</w:t>
+        <w:t>16</w:t>
       </w:r>
     </w:p>
     <w:p>
@@ -978,7 +978,7 @@
         </w:rPr>
         <w:t>Key ideas for Lab 4</w:t>
         <w:tab/>
-        <w:t>16</w:t>
+        <w:t>17</w:t>
       </w:r>
     </w:p>
     <w:p>
@@ -996,7 +996,7 @@
         </w:rPr>
         <w:t>From Objective to Storyboard</w:t>
         <w:tab/>
-        <w:t>16</w:t>
+        <w:t>17</w:t>
       </w:r>
     </w:p>
     <w:p>
@@ -1014,7 +1014,7 @@
         </w:rPr>
         <w:t>The Five-Beat Storyboard</w:t>
         <w:tab/>
-        <w:t>16</w:t>
+        <w:t>17</w:t>
       </w:r>
     </w:p>
     <w:p>
@@ -1032,7 +1032,7 @@
         </w:rPr>
         <w:t>Lab 4 — Ideation Sub-agents and a Digital Storyboard</w:t>
         <w:tab/>
-        <w:t>16</w:t>
+        <w:t>17</w:t>
       </w:r>
     </w:p>
     <w:p>
@@ -1050,7 +1050,7 @@
         </w:rPr>
         <w:t>Topic 1 recap</w:t>
         <w:tab/>
-        <w:t>18</w:t>
+        <w:t>19</w:t>
       </w:r>
     </w:p>
     <w:p>
@@ -1068,7 +1068,7 @@
         </w:rPr>
         <w:t>Where You Are Now</w:t>
         <w:tab/>
-        <w:t>18</w:t>
+        <w:t>19</w:t>
       </w:r>
     </w:p>
     <w:p>
@@ -1086,7 +1086,7 @@
         </w:rPr>
         <w:t>Topic 2 — Audience Research and Content Requirement Analysis</w:t>
         <w:tab/>
-        <w:t>18</w:t>
+        <w:t>19</w:t>
       </w:r>
     </w:p>
     <w:p>
@@ -1104,7 +1104,7 @@
         </w:rPr>
         <w:t>Key ideas for Lab 5</w:t>
         <w:tab/>
-        <w:t>18</w:t>
+        <w:t>19</w:t>
       </w:r>
     </w:p>
     <w:p>
@@ -1122,7 +1122,7 @@
         </w:rPr>
         <w:t>Evidence Before Personas</w:t>
         <w:tab/>
-        <w:t>18</w:t>
+        <w:t>19</w:t>
       </w:r>
     </w:p>
     <w:p>
@@ -1140,7 +1140,7 @@
         </w:rPr>
         <w:t>Observed, Inferred or Low Confidence?</w:t>
         <w:tab/>
-        <w:t>18</w:t>
+        <w:t>19</w:t>
       </w:r>
     </w:p>
     <w:p>
@@ -1158,7 +1158,7 @@
         </w:rPr>
         <w:t>Data Agents Must Count</w:t>
         <w:tab/>
-        <w:t>18</w:t>
+        <w:t>19</w:t>
       </w:r>
     </w:p>
     <w:p>
@@ -1176,7 +1176,7 @@
         </w:rPr>
         <w:t>Lab 5 — Audience Research and Personas from Evidence</w:t>
         <w:tab/>
-        <w:t>19</w:t>
+        <w:t>20</w:t>
       </w:r>
     </w:p>
     <w:p>
@@ -1194,7 +1194,7 @@
         </w:rPr>
         <w:t>Key ideas for Lab 6</w:t>
         <w:tab/>
-        <w:t>20</w:t>
+        <w:t>21</w:t>
       </w:r>
     </w:p>
     <w:p>
@@ -1212,7 +1212,7 @@
         </w:rPr>
         <w:t>Finding the Right Frequency</w:t>
         <w:tab/>
-        <w:t>20</w:t>
+        <w:t>21</w:t>
       </w:r>
     </w:p>
     <w:p>
@@ -1230,7 +1230,7 @@
         </w:rPr>
         <w:t>Lab 6 — Content Cadence and the Editorial Calendar</w:t>
         <w:tab/>
-        <w:t>20</w:t>
+        <w:t>21</w:t>
       </w:r>
     </w:p>
     <w:p>
@@ -1248,7 +1248,7 @@
         </w:rPr>
         <w:t>Key ideas for Lab 7</w:t>
         <w:tab/>
-        <w:t>21</w:t>
+        <w:t>22</w:t>
       </w:r>
     </w:p>
     <w:p>
@@ -1266,7 +1266,7 @@
         </w:rPr>
         <w:t>Skills vs Project Rules</w:t>
         <w:tab/>
-        <w:t>21</w:t>
+        <w:t>22</w:t>
       </w:r>
     </w:p>
     <w:p>
@@ -1284,7 +1284,7 @@
         </w:rPr>
         <w:t>One Skill Set for Every Tool</w:t>
         <w:tab/>
-        <w:t>22</w:t>
+        <w:t>23</w:t>
       </w:r>
     </w:p>
     <w:p>
@@ -1302,7 +1302,7 @@
         </w:rPr>
         <w:t>The Four Studio Skills</w:t>
         <w:tab/>
-        <w:t>22</w:t>
+        <w:t>23</w:t>
       </w:r>
     </w:p>
     <w:p>
@@ -1320,7 +1320,7 @@
         </w:rPr>
         <w:t>Lab 7 — Studio Skills: Voice, Facts, Compliance and Formats</w:t>
         <w:tab/>
-        <w:t>22</w:t>
+        <w:t>23</w:t>
       </w:r>
     </w:p>
     <w:p>
@@ -1338,7 +1338,7 @@
         </w:rPr>
         <w:t>Topic 2 recap</w:t>
         <w:tab/>
-        <w:t>23</w:t>
+        <w:t>24</w:t>
       </w:r>
     </w:p>
     <w:p>
@@ -1356,7 +1356,7 @@
         </w:rPr>
         <w:t>Day 1: Research, Build and Plan</w:t>
         <w:tab/>
-        <w:t>23</w:t>
+        <w:t>24</w:t>
       </w:r>
     </w:p>
     <w:p>
@@ -1374,7 +1374,7 @@
         </w:rPr>
         <w:t>Topic 3 — Multi-Channel Content Creation and Agent Workflow Coordination</w:t>
         <w:tab/>
-        <w:t>23</w:t>
+        <w:t>24</w:t>
       </w:r>
     </w:p>
     <w:p>
@@ -1392,7 +1392,7 @@
         </w:rPr>
         <w:t>Key ideas for Lab 8</w:t>
         <w:tab/>
-        <w:t>24</w:t>
+        <w:t>25</w:t>
       </w:r>
     </w:p>
     <w:p>
@@ -1410,7 +1410,7 @@
         </w:rPr>
         <w:t>Subagents vs Agent Teams</w:t>
         <w:tab/>
-        <w:t>24</w:t>
+        <w:t>25</w:t>
       </w:r>
     </w:p>
     <w:p>
@@ -1428,7 +1428,7 @@
         </w:rPr>
         <w:t>Which Pattern When?</w:t>
         <w:tab/>
-        <w:t>24</w:t>
+        <w:t>25</w:t>
       </w:r>
     </w:p>
     <w:p>
@@ -1446,7 +1446,7 @@
         </w:rPr>
         <w:t>Anatomy of a Subagent</w:t>
         <w:tab/>
-        <w:t>24</w:t>
+        <w:t>25</w:t>
       </w:r>
     </w:p>
     <w:p>
@@ -1464,7 +1464,7 @@
         </w:rPr>
         <w:t>Running an Agent Team</w:t>
         <w:tab/>
-        <w:t>25</w:t>
+        <w:t>26</w:t>
       </w:r>
     </w:p>
     <w:p>
@@ -1482,7 +1482,7 @@
         </w:rPr>
         <w:t>Human in the Loop, Enforced</w:t>
         <w:tab/>
-        <w:t>25</w:t>
+        <w:t>26</w:t>
       </w:r>
     </w:p>
     <w:p>
@@ -1500,7 +1500,7 @@
         </w:rPr>
         <w:t>The Hook That Holds the Gate</w:t>
         <w:tab/>
-        <w:t>25</w:t>
+        <w:t>26</w:t>
       </w:r>
     </w:p>
     <w:p>
@@ -1518,7 +1518,7 @@
         </w:rPr>
         <w:t>The Publishing APIs</w:t>
         <w:tab/>
-        <w:t>26</w:t>
+        <w:t>27</w:t>
       </w:r>
     </w:p>
     <w:p>
@@ -1536,7 +1536,7 @@
         </w:rPr>
         <w:t>Lab 8 — The Human Approval Gate and the Publishers</w:t>
         <w:tab/>
-        <w:t>26</w:t>
+        <w:t>27</w:t>
       </w:r>
     </w:p>
     <w:p>
@@ -1554,7 +1554,7 @@
         </w:rPr>
         <w:t>Key ideas for Lab 9</w:t>
         <w:tab/>
-        <w:t>27</w:t>
+        <w:t>28</w:t>
       </w:r>
     </w:p>
     <w:p>
@@ -1572,7 +1572,7 @@
         </w:rPr>
         <w:t>The Social Media Team</w:t>
         <w:tab/>
-        <w:t>27</w:t>
+        <w:t>28</w:t>
       </w:r>
     </w:p>
     <w:p>
@@ -1590,7 +1590,7 @@
         </w:rPr>
         <w:t>Lab 9 — The Social Media Agent Team: LinkedIn and Facebook</w:t>
         <w:tab/>
-        <w:t>28</w:t>
+        <w:t>29</w:t>
       </w:r>
     </w:p>
     <w:p>
@@ -1608,7 +1608,7 @@
         </w:rPr>
         <w:t>Key ideas for Lab 10</w:t>
         <w:tab/>
-        <w:t>29</w:t>
+        <w:t>30</w:t>
       </w:r>
     </w:p>
     <w:p>
@@ -1626,7 +1626,7 @@
         </w:rPr>
         <w:t>The Newsletter Team</w:t>
         <w:tab/>
-        <w:t>29</w:t>
+        <w:t>30</w:t>
       </w:r>
     </w:p>
     <w:p>
@@ -1644,7 +1644,7 @@
         </w:rPr>
         <w:t>Lab 10 — The Newsletter Agent Team: the Sunny Sunday Email</w:t>
         <w:tab/>
-        <w:t>29</w:t>
+        <w:t>30</w:t>
       </w:r>
     </w:p>
     <w:p>
@@ -1662,7 +1662,7 @@
         </w:rPr>
         <w:t>Key ideas for Lab 11</w:t>
         <w:tab/>
-        <w:t>31</w:t>
+        <w:t>32</w:t>
       </w:r>
     </w:p>
     <w:p>
@@ -1680,7 +1680,7 @@
         </w:rPr>
         <w:t>The Video Team</w:t>
         <w:tab/>
-        <w:t>31</w:t>
+        <w:t>32</w:t>
       </w:r>
     </w:p>
     <w:p>
@@ -1698,7 +1698,7 @@
         </w:rPr>
         <w:t>Lab 11 — The Video Agent Team: Script to YouTube</w:t>
         <w:tab/>
-        <w:t>31</w:t>
+        <w:t>32</w:t>
       </w:r>
     </w:p>
     <w:p>
@@ -1716,7 +1716,7 @@
         </w:rPr>
         <w:t>Topic 3 recap</w:t>
         <w:tab/>
-        <w:t>32</w:t>
+        <w:t>33</w:t>
       </w:r>
     </w:p>
     <w:p>
@@ -1734,7 +1734,7 @@
         </w:rPr>
         <w:t>Where You Are Now</w:t>
         <w:tab/>
-        <w:t>32</w:t>
+        <w:t>33</w:t>
       </w:r>
     </w:p>
     <w:p>
@@ -1752,7 +1752,7 @@
         </w:rPr>
         <w:t>Topic 4 — Content Distribution, Strategy Guidelines and Responsible AI Practices</w:t>
         <w:tab/>
-        <w:t>32</w:t>
+        <w:t>33</w:t>
       </w:r>
     </w:p>
     <w:p>
@@ -1770,7 +1770,7 @@
         </w:rPr>
         <w:t>Key ideas for Lab 12</w:t>
         <w:tab/>
-        <w:t>33</w:t>
+        <w:t>34</w:t>
       </w:r>
     </w:p>
     <w:p>
@@ -1788,7 +1788,7 @@
         </w:rPr>
         <w:t>What Is Hermes Agent?</w:t>
         <w:tab/>
-        <w:t>33</w:t>
+        <w:t>34</w:t>
       </w:r>
     </w:p>
     <w:p>
@@ -1806,7 +1806,7 @@
         </w:rPr>
         <w:t>The Hermes Kanban Board</w:t>
         <w:tab/>
-        <w:t>33</w:t>
+        <w:t>34</w:t>
       </w:r>
     </w:p>
     <w:p>
@@ -1824,7 +1824,7 @@
         </w:rPr>
         <w:t>A Role Pipeline on the Board</w:t>
         <w:tab/>
-        <w:t>33</w:t>
+        <w:t>34</w:t>
       </w:r>
     </w:p>
     <w:p>
@@ -1842,7 +1842,7 @@
         </w:rPr>
         <w:t>Claude Agent Teams or Hermes Kanban?</w:t>
         <w:tab/>
-        <w:t>34</w:t>
+        <w:t>35</w:t>
       </w:r>
     </w:p>
     <w:p>
@@ -1860,7 +1860,7 @@
         </w:rPr>
         <w:t>Lab 12 — Hermes Agent Bots on a Kanban Board</w:t>
         <w:tab/>
-        <w:t>34</w:t>
+        <w:t>35</w:t>
       </w:r>
     </w:p>
     <w:p>
@@ -1878,7 +1878,7 @@
         </w:rPr>
         <w:t>Key ideas for Lab 13</w:t>
         <w:tab/>
-        <w:t>35</w:t>
+        <w:t>36</w:t>
       </w:r>
     </w:p>
     <w:p>
@@ -1896,7 +1896,7 @@
         </w:rPr>
         <w:t>Always-On Delivery</w:t>
         <w:tab/>
-        <w:t>35</w:t>
+        <w:t>36</w:t>
       </w:r>
     </w:p>
     <w:p>
@@ -1914,7 +1914,7 @@
         </w:rPr>
         <w:t>Lab 13 — Always On: a Telegram Bot That Asks Before It Acts</w:t>
         <w:tab/>
-        <w:t>36</w:t>
+        <w:t>37</w:t>
       </w:r>
     </w:p>
     <w:p>
@@ -1932,7 +1932,7 @@
         </w:rPr>
         <w:t>Key ideas for Lab 14</w:t>
         <w:tab/>
-        <w:t>37</w:t>
+        <w:t>38</w:t>
       </w:r>
     </w:p>
     <w:p>
@@ -1950,7 +1950,7 @@
         </w:rPr>
         <w:t>Responsible AI in the Studio</w:t>
         <w:tab/>
-        <w:t>37</w:t>
+        <w:t>38</w:t>
       </w:r>
     </w:p>
     <w:p>
@@ -1968,7 +1968,7 @@
         </w:rPr>
         <w:t>Measure What Matters</w:t>
         <w:tab/>
-        <w:t>37</w:t>
+        <w:t>38</w:t>
       </w:r>
     </w:p>
     <w:p>
@@ -1986,7 +1986,7 @@
         </w:rPr>
         <w:t>Lab 14 — Measure, Govern and Write the Playbook</w:t>
         <w:tab/>
-        <w:t>37</w:t>
+        <w:t>38</w:t>
       </w:r>
     </w:p>
     <w:p>
@@ -2004,7 +2004,7 @@
         </w:rPr>
         <w:t>Course Summary</w:t>
         <w:tab/>
-        <w:t>38</w:t>
+        <w:t>39</w:t>
       </w:r>
     </w:p>
     <w:p>
@@ -2022,7 +2022,7 @@
         </w:rPr>
         <w:t>How Each Pattern Is Triggered</w:t>
         <w:tab/>
-        <w:t>38</w:t>
+        <w:t>39</w:t>
       </w:r>
     </w:p>
     <w:p>
@@ -2040,7 +2040,25 @@
         </w:rPr>
         <w:t>Horizon: Research to an Always-On Studio</w:t>
         <w:tab/>
-        <w:t>39</w:t>
+        <w:t>40</w:t>
+      </w:r>
+    </w:p>
+    <w:p>
+      <w:pPr>
+        <w:tabs>
+          <w:tab w:pos="9648" w:val="right" w:leader="dot"/>
+        </w:tabs>
+        <w:spacing w:after="20"/>
+        <w:ind w:left="720"/>
+      </w:pPr>
+      <w:r>
+        <w:rPr>
+          <w:b w:val="0"/>
+          <w:sz w:val="19"/>
+        </w:rPr>
+        <w:t>Practice Exam: Claude Certified Associate</w:t>
+        <w:tab/>
+        <w:t>40</w:t>
       </w:r>
     </w:p>
     <w:p>
@@ -2058,7 +2076,7 @@
         </w:rPr>
         <w:t>Quick Command Reference</w:t>
         <w:tab/>
-        <w:t>39</w:t>
+        <w:t>41</w:t>
       </w:r>
     </w:p>
     <w:p>
@@ -2076,7 +2094,7 @@
         </w:rPr>
         <w:t>Support</w:t>
         <w:tab/>
-        <w:t>40</w:t>
+        <w:t>41</w:t>
       </w:r>
     </w:p>
     <w:p>
@@ -2094,7 +2112,7 @@
         </w:rPr>
         <w:t>Assessment flow</w:t>
         <w:tab/>
-        <w:t>40</w:t>
+        <w:t>41</w:t>
       </w:r>
       <w:r>
         <w:fldChar w:fldCharType="end"/>
@@ -12979,7 +12997,7 @@
     </w:p>
     <w:p>
       <w:r>
-        <w:t>Slides 112–141. In this topic you will:</w:t>
+        <w:t>Slides 112–142. In this topic you will:</w:t>
       </w:r>
     </w:p>
     <w:p>
@@ -15564,6 +15582,109 @@
           <w:b w:val="0"/>
         </w:rPr>
         <w:t xml:space="preserve"> — Hermes bots on Kanban, measured and governed.</w:t>
+      </w:r>
+    </w:p>
+    <w:p>
+      <w:pPr>
+        <w:pStyle w:val="Heading3"/>
+      </w:pPr>
+      <w:r>
+        <w:t>Practice Exam: Claude Certified Associate</w:t>
+      </w:r>
+    </w:p>
+    <w:p>
+      <w:r>
+        <w:t>exams.tertiaryinfotech.com/practice-exams/anthropic/anthropic-ccao-foundations</w:t>
+      </w:r>
+    </w:p>
+    <w:p>
+      <w:pPr>
+        <w:jc w:val="center"/>
+      </w:pPr>
+      <w:r>
+        <w:drawing>
+          <wp:inline xmlns:a="http://schemas.openxmlformats.org/drawingml/2006/main" xmlns:pic="http://schemas.openxmlformats.org/drawingml/2006/picture">
+            <wp:extent cx="5303520" cy="3563302"/>
+            <wp:docPr id="5" name="Picture 5"/>
+            <wp:cNvGraphicFramePr>
+              <a:graphicFrameLocks noChangeAspect="1"/>
+            </wp:cNvGraphicFramePr>
+            <a:graphic>
+              <a:graphicData uri="http://schemas.openxmlformats.org/drawingml/2006/picture">
+                <pic:pic>
+                  <pic:nvPicPr>
+                    <pic:cNvPr id="0" name="practice-exam.png"/>
+                    <pic:cNvPicPr/>
+                  </pic:nvPicPr>
+                  <pic:blipFill>
+                    <a:blip r:embed="rId14"/>
+                    <a:stretch>
+                      <a:fillRect/>
+                    </a:stretch>
+                  </pic:blipFill>
+                  <pic:spPr>
+                    <a:xfrm>
+                      <a:off x="0" y="0"/>
+                      <a:ext cx="5303520" cy="3563302"/>
+                    </a:xfrm>
+                    <a:prstGeom prst="rect"/>
+                  </pic:spPr>
+                </pic:pic>
+              </a:graphicData>
+            </a:graphic>
+          </wp:inline>
+        </w:drawing>
+      </w:r>
+    </w:p>
+    <w:p>
+      <w:pPr>
+        <w:pStyle w:val="ListBullet"/>
+      </w:pPr>
+      <w:r>
+        <w:rPr>
+          <w:b/>
+        </w:rPr>
+        <w:t>CCAO-F · Foundations</w:t>
+      </w:r>
+      <w:r>
+        <w:rPr>
+          <w:b w:val="0"/>
+        </w:rPr>
+        <w:t xml:space="preserve"> — For professionals who use Claude as a productivity tool — the Cowork side of this course.</w:t>
+      </w:r>
+    </w:p>
+    <w:p>
+      <w:pPr>
+        <w:pStyle w:val="ListBullet"/>
+      </w:pPr>
+      <w:r>
+        <w:rPr>
+          <w:b/>
+        </w:rPr>
+        <w:t>What it covers</w:t>
+      </w:r>
+      <w:r>
+        <w:rPr>
+          <w:b w:val="0"/>
+        </w:rPr>
+        <w:t xml:space="preserve"> — Prompting and task execution, output evaluation, model selection, workflow integration, responsible use.</w:t>
+      </w:r>
+    </w:p>
+    <w:p>
+      <w:pPr>
+        <w:pStyle w:val="ListBullet"/>
+      </w:pPr>
+      <w:r>
+        <w:rPr>
+          <w:b/>
+        </w:rPr>
+        <w:t>Try it free</w:t>
+      </w:r>
+      <w:r>
+        <w:rPr>
+          <w:b w:val="0"/>
+        </w:rPr>
+        <w:t xml:space="preserve"> — Start with the free practice teaser; exam mode is 60 questions in 120 minutes.</w:t>
       </w:r>
     </w:p>
     <w:p>

</xml_diff>

<commit_message>
feat: add Claude Code: Plan Before You Build slide before the Codex slide
Co-Authored-By: Claude Opus 5.5 <noreply@anthropic.com>
</commit_message>
<xml_diff>
--- a/courseware/LG-Multi AI Agents Workflow for Content Creation-v2.0.docx
+++ b/courseware/LG-Multi AI Agents Workflow for Content Creation-v2.0.docx
@@ -832,7 +832,7 @@
           <w:b w:val="0"/>
           <w:sz w:val="19"/>
         </w:rPr>
-        <w:t>Codex: Plan Before You Build</w:t>
+        <w:t>Claude Code: Plan Before You Build</w:t>
         <w:tab/>
         <w:t>12</w:t>
       </w:r>
@@ -850,7 +850,7 @@
           <w:b w:val="0"/>
           <w:sz w:val="19"/>
         </w:rPr>
-        <w:t>The Retirement Calculator</w:t>
+        <w:t>Codex: Plan Before You Build</w:t>
         <w:tab/>
         <w:t>12</w:t>
       </w:r>
@@ -868,6 +868,24 @@
           <w:b w:val="0"/>
           <w:sz w:val="19"/>
         </w:rPr>
+        <w:t>The Retirement Calculator</w:t>
+        <w:tab/>
+        <w:t>13</w:t>
+      </w:r>
+    </w:p>
+    <w:p>
+      <w:pPr>
+        <w:tabs>
+          <w:tab w:pos="9648" w:val="right" w:leader="dot"/>
+        </w:tabs>
+        <w:spacing w:after="20"/>
+        <w:ind w:left="720"/>
+      </w:pPr>
+      <w:r>
+        <w:rPr>
+          <w:b w:val="0"/>
+          <w:sz w:val="19"/>
+        </w:rPr>
         <w:t>Checklist and Contact Form</w:t>
         <w:tab/>
         <w:t>13</w:t>
@@ -942,7 +960,7 @@
         </w:rPr>
         <w:t>A Reviewer That Only Reports</w:t>
         <w:tab/>
-        <w:t>15</w:t>
+        <w:t>16</w:t>
       </w:r>
     </w:p>
     <w:p>
@@ -1014,7 +1032,7 @@
         </w:rPr>
         <w:t>The Five-Beat Storyboard</w:t>
         <w:tab/>
-        <w:t>17</w:t>
+        <w:t>18</w:t>
       </w:r>
     </w:p>
     <w:p>
@@ -1032,7 +1050,7 @@
         </w:rPr>
         <w:t>Lab 4 — Ideation Sub-agents and a Digital Storyboard</w:t>
         <w:tab/>
-        <w:t>17</w:t>
+        <w:t>18</w:t>
       </w:r>
     </w:p>
     <w:p>
@@ -1140,7 +1158,7 @@
         </w:rPr>
         <w:t>Observed, Inferred or Low Confidence?</w:t>
         <w:tab/>
-        <w:t>19</w:t>
+        <w:t>20</w:t>
       </w:r>
     </w:p>
     <w:p>
@@ -1158,7 +1176,7 @@
         </w:rPr>
         <w:t>Data Agents Must Count</w:t>
         <w:tab/>
-        <w:t>19</w:t>
+        <w:t>20</w:t>
       </w:r>
     </w:p>
     <w:p>
@@ -1248,7 +1266,7 @@
         </w:rPr>
         <w:t>Key ideas for Lab 7</w:t>
         <w:tab/>
-        <w:t>22</w:t>
+        <w:t>23</w:t>
       </w:r>
     </w:p>
     <w:p>
@@ -1266,7 +1284,7 @@
         </w:rPr>
         <w:t>Skills vs Project Rules</w:t>
         <w:tab/>
-        <w:t>22</w:t>
+        <w:t>23</w:t>
       </w:r>
     </w:p>
     <w:p>
@@ -1320,7 +1338,7 @@
         </w:rPr>
         <w:t>Lab 7 — Studio Skills: Voice, Facts, Compliance and Formats</w:t>
         <w:tab/>
-        <w:t>23</w:t>
+        <w:t>24</w:t>
       </w:r>
     </w:p>
     <w:p>
@@ -1338,7 +1356,7 @@
         </w:rPr>
         <w:t>Topic 2 recap</w:t>
         <w:tab/>
-        <w:t>24</w:t>
+        <w:t>25</w:t>
       </w:r>
     </w:p>
     <w:p>
@@ -1356,7 +1374,7 @@
         </w:rPr>
         <w:t>Day 1: Research, Build and Plan</w:t>
         <w:tab/>
-        <w:t>24</w:t>
+        <w:t>25</w:t>
       </w:r>
     </w:p>
     <w:p>
@@ -1374,7 +1392,7 @@
         </w:rPr>
         <w:t>Topic 3 — Multi-Channel Content Creation and Agent Workflow Coordination</w:t>
         <w:tab/>
-        <w:t>24</w:t>
+        <w:t>25</w:t>
       </w:r>
     </w:p>
     <w:p>
@@ -1446,7 +1464,7 @@
         </w:rPr>
         <w:t>Anatomy of a Subagent</w:t>
         <w:tab/>
-        <w:t>25</w:t>
+        <w:t>26</w:t>
       </w:r>
     </w:p>
     <w:p>
@@ -1500,7 +1518,7 @@
         </w:rPr>
         <w:t>The Hook That Holds the Gate</w:t>
         <w:tab/>
-        <w:t>26</w:t>
+        <w:t>27</w:t>
       </w:r>
     </w:p>
     <w:p>
@@ -1554,7 +1572,7 @@
         </w:rPr>
         <w:t>Key ideas for Lab 9</w:t>
         <w:tab/>
-        <w:t>28</w:t>
+        <w:t>29</w:t>
       </w:r>
     </w:p>
     <w:p>
@@ -1572,7 +1590,7 @@
         </w:rPr>
         <w:t>The Social Media Team</w:t>
         <w:tab/>
-        <w:t>28</w:t>
+        <w:t>29</w:t>
       </w:r>
     </w:p>
     <w:p>
@@ -1644,7 +1662,7 @@
         </w:rPr>
         <w:t>Lab 10 — The Newsletter Agent Team: the Sunny Sunday Email</w:t>
         <w:tab/>
-        <w:t>30</w:t>
+        <w:t>31</w:t>
       </w:r>
     </w:p>
     <w:p>
@@ -1752,7 +1770,7 @@
         </w:rPr>
         <w:t>Topic 4 — Content Distribution, Strategy Guidelines and Responsible AI Practices</w:t>
         <w:tab/>
-        <w:t>33</w:t>
+        <w:t>34</w:t>
       </w:r>
     </w:p>
     <w:p>
@@ -1878,7 +1896,7 @@
         </w:rPr>
         <w:t>Key ideas for Lab 13</w:t>
         <w:tab/>
-        <w:t>36</w:t>
+        <w:t>37</w:t>
       </w:r>
     </w:p>
     <w:p>
@@ -1896,7 +1914,7 @@
         </w:rPr>
         <w:t>Always-On Delivery</w:t>
         <w:tab/>
-        <w:t>36</w:t>
+        <w:t>37</w:t>
       </w:r>
     </w:p>
     <w:p>
@@ -2004,7 +2022,7 @@
         </w:rPr>
         <w:t>Course Summary</w:t>
         <w:tab/>
-        <w:t>39</w:t>
+        <w:t>40</w:t>
       </w:r>
     </w:p>
     <w:p>
@@ -2022,7 +2040,7 @@
         </w:rPr>
         <w:t>How Each Pattern Is Triggered</w:t>
         <w:tab/>
-        <w:t>39</w:t>
+        <w:t>40</w:t>
       </w:r>
     </w:p>
     <w:p>
@@ -2094,7 +2112,7 @@
         </w:rPr>
         <w:t>Support</w:t>
         <w:tab/>
-        <w:t>41</w:t>
+        <w:t>42</w:t>
       </w:r>
     </w:p>
     <w:p>
@@ -2112,7 +2130,7 @@
         </w:rPr>
         <w:t>Assessment flow</w:t>
         <w:tab/>
-        <w:t>41</w:t>
+        <w:t>42</w:t>
       </w:r>
       <w:r>
         <w:fldChar w:fldCharType="end"/>
@@ -3507,7 +3525,7 @@
     </w:p>
     <w:p>
       <w:r>
-        <w:t>Slides 18–53. In this topic you will:</w:t>
+        <w:t>Slides 18–54. In this topic you will:</w:t>
       </w:r>
     </w:p>
     <w:p>
@@ -4823,6 +4841,70 @@
       </w:pPr>
       <w:r>
         <w:t>Key ideas for Lab 2</w:t>
+      </w:r>
+    </w:p>
+    <w:p>
+      <w:pPr>
+        <w:pStyle w:val="Heading3"/>
+      </w:pPr>
+      <w:r>
+        <w:t>Claude Code: Plan Before You Build</w:t>
+      </w:r>
+    </w:p>
+    <w:p>
+      <w:r>
+        <w:t>The same habit in Claude: plan first, build from the brief, keep the rules in CLAUDE.md.</w:t>
+      </w:r>
+    </w:p>
+    <w:p>
+      <w:pPr>
+        <w:pStyle w:val="ListBullet"/>
+      </w:pPr>
+      <w:r>
+        <w:rPr>
+          <w:b/>
+        </w:rPr>
+        <w:t>Plan mode first</w:t>
+      </w:r>
+      <w:r>
+        <w:rPr>
+          <w:b w:val="0"/>
+        </w:rPr>
+        <w:t xml:space="preserve"> — Press Shift+Tab until the mode reads plan. Claude reads the brief and proposes the steps — nothing changes until you approve.</w:t>
+      </w:r>
+    </w:p>
+    <w:p>
+      <w:pPr>
+        <w:pStyle w:val="ListBullet"/>
+      </w:pPr>
+      <w:r>
+        <w:rPr>
+          <w:b/>
+        </w:rPr>
+        <w:t>Build from the brief</w:t>
+      </w:r>
+      <w:r>
+        <w:rPr>
+          <w:b w:val="0"/>
+        </w:rPr>
+        <w:t xml:space="preserve"> — Point it at site-brief.md, brand.md and the CSVs. Ask it to list what it could not determine before it writes a line.</w:t>
+      </w:r>
+    </w:p>
+    <w:p>
+      <w:pPr>
+        <w:pStyle w:val="ListBullet"/>
+      </w:pPr>
+      <w:r>
+        <w:rPr>
+          <w:b/>
+        </w:rPr>
+        <w:t>CLAUDE.md</w:t>
+      </w:r>
+      <w:r>
+        <w:rPr>
+          <w:b w:val="0"/>
+        </w:rPr>
+        <w:t xml:space="preserve"> — /init drafts the project memory. Add @AGENTS.md to it so Claude and Codex follow the same rules file.</w:t>
       </w:r>
     </w:p>
     <w:p>
@@ -5180,7 +5262,7 @@
         <w:rPr>
           <w:b w:val="0"/>
         </w:rPr>
-        <w:t xml:space="preserve"> 35–38</w:t>
+        <w:t xml:space="preserve"> 36–39</w:t>
       </w:r>
     </w:p>
     <w:p>
@@ -6187,7 +6269,7 @@
         <w:rPr>
           <w:b w:val="0"/>
         </w:rPr>
-        <w:t xml:space="preserve"> 41–45</w:t>
+        <w:t xml:space="preserve"> 42–46</w:t>
       </w:r>
     </w:p>
     <w:p>
@@ -6838,7 +6920,7 @@
         <w:rPr>
           <w:b w:val="0"/>
         </w:rPr>
-        <w:t xml:space="preserve"> 48–52</w:t>
+        <w:t xml:space="preserve"> 49–53</w:t>
       </w:r>
     </w:p>
     <w:p>
@@ -7298,7 +7380,7 @@
     </w:p>
     <w:p>
       <w:r>
-        <w:t>Slides 54–77. In this topic you will:</w:t>
+        <w:t>Slides 55–78. In this topic you will:</w:t>
       </w:r>
     </w:p>
     <w:p>
@@ -7869,7 +7951,7 @@
         <w:rPr>
           <w:b w:val="0"/>
         </w:rPr>
-        <w:t xml:space="preserve"> 58–62</w:t>
+        <w:t xml:space="preserve"> 59–63</w:t>
       </w:r>
     </w:p>
     <w:p>
@@ -8376,7 +8458,7 @@
         <w:rPr>
           <w:b w:val="0"/>
         </w:rPr>
-        <w:t xml:space="preserve"> 64–68</w:t>
+        <w:t xml:space="preserve"> 65–69</w:t>
       </w:r>
     </w:p>
     <w:p>
@@ -9238,7 +9320,7 @@
         <w:rPr>
           <w:b w:val="0"/>
         </w:rPr>
-        <w:t xml:space="preserve"> 72–76</w:t>
+        <w:t xml:space="preserve"> 73–77</w:t>
       </w:r>
     </w:p>
     <w:p>
@@ -9655,7 +9737,7 @@
     </w:p>
     <w:p>
       <w:r>
-        <w:t>Slides 78–111. In this topic you will:</w:t>
+        <w:t>Slides 79–112. In this topic you will:</w:t>
       </w:r>
     </w:p>
     <w:p>
@@ -10928,7 +11010,7 @@
         <w:rPr>
           <w:b w:val="0"/>
         </w:rPr>
-        <w:t xml:space="preserve"> 86–90</w:t>
+        <w:t xml:space="preserve"> 87–91</w:t>
       </w:r>
     </w:p>
     <w:p>
@@ -11506,7 +11588,7 @@
         <w:rPr>
           <w:b w:val="0"/>
         </w:rPr>
-        <w:t xml:space="preserve"> 92–97</w:t>
+        <w:t xml:space="preserve"> 93–98</w:t>
       </w:r>
     </w:p>
     <w:p>
@@ -12053,7 +12135,7 @@
         <w:rPr>
           <w:b w:val="0"/>
         </w:rPr>
-        <w:t xml:space="preserve"> 99–103</w:t>
+        <w:t xml:space="preserve"> 100–104</w:t>
       </w:r>
     </w:p>
     <w:p>
@@ -12551,7 +12633,7 @@
         <w:rPr>
           <w:b w:val="0"/>
         </w:rPr>
-        <w:t xml:space="preserve"> 105–110</w:t>
+        <w:t xml:space="preserve"> 106–111</w:t>
       </w:r>
     </w:p>
     <w:p>
@@ -12997,7 +13079,7 @@
     </w:p>
     <w:p>
       <w:r>
-        <w:t>Slides 112–142. In this topic you will:</w:t>
+        <w:t>Slides 113–143. In this topic you will:</w:t>
       </w:r>
     </w:p>
     <w:p>
@@ -13649,7 +13731,7 @@
         <w:rPr>
           <w:b w:val="0"/>
         </w:rPr>
-        <w:t xml:space="preserve"> 117–121</w:t>
+        <w:t xml:space="preserve"> 118–122</w:t>
       </w:r>
     </w:p>
     <w:p>
@@ -14240,7 +14322,7 @@
         <w:rPr>
           <w:b w:val="0"/>
         </w:rPr>
-        <w:t xml:space="preserve"> 123–126</w:t>
+        <w:t xml:space="preserve"> 124–127</w:t>
       </w:r>
     </w:p>
     <w:p>
@@ -15065,7 +15147,7 @@
         <w:rPr>
           <w:b w:val="0"/>
         </w:rPr>
-        <w:t xml:space="preserve"> 129–133</w:t>
+        <w:t xml:space="preserve"> 130–134</w:t>
       </w:r>
     </w:p>
     <w:p>

</xml_diff>